<commit_message>
⚙️ Auto-génération des classes et des specs
</commit_message>
<xml_diff>
--- a/csv_parser/out/GEO-POS/GEO-POS.schema.docx
+++ b/csv_parser/out/GEO-POS/GEO-POS.schema.docx
@@ -264,7 +264,7 @@
             <w:r>
               <w:t>string</w:t>
               <w:br/>
-              <w:t>(REGEX: ^([\w-]+\.){3,8}resource(\.[\w-]+){1,2}$)</w:t>
+              <w:t>(REGEX: ^([a-zA-Z0-9_-]+\.){3,8}resource(\.[a-zA-Z0-9_-]+){1,2}$)</w:t>
             </w:r>
           </w:p>
         </w:tc>
@@ -518,7 +518,7 @@
           </w:tcPr>
           <w:p>
             <w:r>
-              <w:t>string</w:t>
+              <w:t>number</w:t>
             </w:r>
           </w:p>
         </w:tc>

</xml_diff>